<commit_message>
style: apply taste-skill design rules and update application helper docs
</commit_message>
<xml_diff>
--- a/nejrotonnel_zayavka.docx
+++ b/nejrotonnel_zayavka.docx
@@ -5,7 +5,6 @@
     <w:p>
       <w:pPr>
         <w:spacing w:after="40"/>
-        <w:jc w:val="left"/>
       </w:pPr>
       <w:r>
         <w:rPr>
@@ -28,7 +27,7 @@
           <w:color w:val="D4AF37"/>
           <w:sz w:val="22"/>
         </w:rPr>
-        <w:t>Заявка на участие в акселераторе #Нейрофест2026</w:t>
+        <w:t>Материалы для заполнения анкеты проекта #Нейрофест2026</w:t>
       </w:r>
     </w:p>
     <w:p>
@@ -42,186 +41,275 @@
     <w:p>
       <w:pPr>
         <w:keepNext/>
-        <w:spacing w:before="280" w:after="120"/>
+        <w:spacing w:before="240" w:after="80"/>
       </w:pPr>
       <w:r>
         <w:rPr>
           <w:rFonts w:ascii="Arial" w:hAnsi="Arial"/>
           <w:b/>
           <w:color w:val="0F172A"/>
-          <w:sz w:val="28"/>
+          <w:sz w:val="26"/>
         </w:rPr>
-        <w:t>НАПРАВЛЕНИЕ / НОМИНАЦИЯ</w:t>
-      </w:r>
-    </w:p>
-    <w:p>
-      <w:pPr>
-        <w:spacing w:after="240"/>
-      </w:pPr>
-      <w:r>
-        <w:rPr>
-          <w:b/>
-        </w:rPr>
-        <w:t>Пространственные и предметные индустрии (Пространственные решения, арт-инсталляции, средовой дизайн)</w:t>
+        <w:t>ПОЛЯ ДЛЯ ЗАПОЛНЕНИЯ В АНКЕТЕ</w:t>
       </w:r>
     </w:p>
     <w:p>
       <w:pPr>
         <w:keepNext/>
-        <w:spacing w:before="280" w:after="120"/>
+        <w:spacing w:before="120" w:after="40"/>
+      </w:pPr>
+      <w:r>
+        <w:rPr>
+          <w:b/>
+          <w:color w:val="475569"/>
+        </w:rPr>
+        <w:t>■ Наименование проекта *:</w:t>
+      </w:r>
+    </w:p>
+    <w:p>
+      <w:pPr>
+        <w:spacing w:after="200"/>
+        <w:ind w:left="288"/>
+      </w:pPr>
+      <w:r>
+        <w:rPr>
+          <w:color w:val="0F172A"/>
+        </w:rPr>
+        <w:t>Нейротуннель «Туннель Состояний» / Neurotunnel: The State Tunnel</w:t>
+      </w:r>
+    </w:p>
+    <w:p>
+      <w:pPr>
+        <w:keepNext/>
+        <w:spacing w:before="120" w:after="40"/>
+      </w:pPr>
+      <w:r>
+        <w:rPr>
+          <w:b/>
+          <w:color w:val="475569"/>
+        </w:rPr>
+        <w:t>■ Стадия проекта *:</w:t>
+      </w:r>
+    </w:p>
+    <w:p>
+      <w:pPr>
+        <w:spacing w:after="200"/>
+        <w:ind w:left="288"/>
+      </w:pPr>
+      <w:r>
+        <w:rPr>
+          <w:color w:val="0F172A"/>
+        </w:rPr>
+        <w:t>Концепция</w:t>
+      </w:r>
+    </w:p>
+    <w:p>
+      <w:pPr>
+        <w:keepNext/>
+        <w:spacing w:before="120" w:after="40"/>
+      </w:pPr>
+      <w:r>
+        <w:rPr>
+          <w:b/>
+          <w:color w:val="475569"/>
+        </w:rPr>
+        <w:t>■ Направление проекта *:</w:t>
+      </w:r>
+    </w:p>
+    <w:p>
+      <w:pPr>
+        <w:spacing w:after="200"/>
+        <w:ind w:left="288"/>
+      </w:pPr>
+      <w:r>
+        <w:rPr>
+          <w:color w:val="0F172A"/>
+        </w:rPr>
+        <w:t>Пространственные и объектные индустрии (а также Цифровые и интерактивные, Звуковые и Музыкальные)</w:t>
+      </w:r>
+    </w:p>
+    <w:p>
+      <w:pPr>
+        <w:keepNext/>
+        <w:spacing w:before="120" w:after="40"/>
+      </w:pPr>
+      <w:r>
+        <w:rPr>
+          <w:b/>
+          <w:color w:val="475569"/>
+        </w:rPr>
+        <w:t>■ Юридический статус *:</w:t>
+      </w:r>
+    </w:p>
+    <w:p>
+      <w:pPr>
+        <w:spacing w:after="200"/>
+        <w:ind w:left="288"/>
+      </w:pPr>
+      <w:r>
+        <w:rPr>
+          <w:color w:val="0F172A"/>
+        </w:rPr>
+        <w:t>ИП (ИП Латыпов В. М.) или Физическое лицо</w:t>
+      </w:r>
+    </w:p>
+    <w:p>
+      <w:pPr>
+        <w:keepNext/>
+        <w:spacing w:before="120" w:after="40"/>
+      </w:pPr>
+      <w:r>
+        <w:rPr>
+          <w:b/>
+          <w:color w:val="475569"/>
+        </w:rPr>
+        <w:t>■ Краткое описание * (лимит 200 символов):</w:t>
+      </w:r>
+    </w:p>
+    <w:p>
+      <w:pPr>
+        <w:spacing w:after="200"/>
+        <w:ind w:left="288"/>
+      </w:pPr>
+      <w:r>
+        <w:rPr>
+          <w:color w:val="0F172A"/>
+        </w:rPr>
+        <w:t>Нейротуннель «Туннель Состояний» — интерактивный шлюз на базе Эмотех, бесконтактно считывающий биометрию человека и гармонизирующий его состояние генеративным звуком и цветом.</w:t>
+      </w:r>
+    </w:p>
+    <w:p>
+      <w:pPr>
+        <w:keepNext/>
+        <w:spacing w:before="120" w:after="40"/>
+      </w:pPr>
+      <w:r>
+        <w:rPr>
+          <w:b/>
+          <w:color w:val="475569"/>
+        </w:rPr>
+        <w:t>■ Актуальность проекта * (лимит 1000 символов):</w:t>
+      </w:r>
+    </w:p>
+    <w:p>
+      <w:pPr>
+        <w:spacing w:after="200"/>
+        <w:ind w:left="288"/>
+      </w:pPr>
+      <w:r>
+        <w:rPr>
+          <w:color w:val="0F172A"/>
+        </w:rPr>
+        <w:t>Жители мегаполисов находятся в состоянии хронического информационного стресса и ментального шума. Приходя в музеи или галереи, люди часто не способны глубоко воспринимать культуру из-за накопленной тревожности. Наш проект решает эту проблему на стыке эмоциональной архитектуры (Эмотех) и бесконтактной биометрии. Нейротуннель бережно считывает состояние посетителя и моментально погружает его в компенсирующую звуковую и цветовую среду, повышая восприимчивость к искусству.</w:t>
+      </w:r>
+    </w:p>
+    <w:p>
+      <w:pPr>
+        <w:keepNext/>
+        <w:spacing w:before="120" w:after="40"/>
+      </w:pPr>
+      <w:r>
+        <w:rPr>
+          <w:b/>
+          <w:color w:val="475569"/>
+        </w:rPr>
+        <w:t>■ Статус реализации на сегодняшний день *:</w:t>
+      </w:r>
+    </w:p>
+    <w:p>
+      <w:pPr>
+        <w:spacing w:after="200"/>
+        <w:ind w:left="288"/>
+      </w:pPr>
+      <w:r>
+        <w:rPr>
+          <w:color w:val="0F172A"/>
+        </w:rPr>
+        <w:t>Разработана архитектурная и технологическая концепция в 5 масштабах (от выставочного модуля до городского моста). Создан рабочий интерактивный веб-симулятор инсталляции с генеративным звуковым и визуальным движком. Проведены предварительные исследования технологии бесконтактного rPPG-мониторинга. Имеется концептуальное видение интеграции проекта на ГЭС-2 и мосту к Красному Октябрю. Подготовлен 3D-видеоролик (walkthrough) проекта.</w:t>
+      </w:r>
+    </w:p>
+    <w:p>
+      <w:pPr>
+        <w:keepNext/>
+        <w:spacing w:before="120" w:after="40"/>
+      </w:pPr>
+      <w:r>
+        <w:rPr>
+          <w:b/>
+          <w:color w:val="475569"/>
+        </w:rPr>
+        <w:t>■ Какой основной ресурс вы ищете в Акселераторе? * (отметить галочками)</w:t>
+      </w:r>
+    </w:p>
+    <w:p>
+      <w:pPr>
+        <w:spacing w:after="60"/>
+        <w:ind w:left="288"/>
+      </w:pPr>
+      <w:r>
+        <w:rPr>
+          <w:b/>
+          <w:color w:val="D4AF37"/>
+        </w:rPr>
+        <w:t xml:space="preserve">✓  </w:t>
+      </w:r>
+      <w:r>
+        <w:t>Партнёры и площадки (для пилотирования на ГЭС-2 и мостах Москвы)</w:t>
+      </w:r>
+    </w:p>
+    <w:p>
+      <w:pPr>
+        <w:spacing w:after="60"/>
+        <w:ind w:left="288"/>
+      </w:pPr>
+      <w:r>
+        <w:rPr>
+          <w:b/>
+          <w:color w:val="D4AF37"/>
+        </w:rPr>
+        <w:t xml:space="preserve">✓  </w:t>
+      </w:r>
+      <w:r>
+        <w:t>Экспертиза и менторство (в части доработки алгоритмов биометрии)</w:t>
+      </w:r>
+    </w:p>
+    <w:p>
+      <w:pPr>
+        <w:spacing w:after="60"/>
+        <w:ind w:left="288"/>
+      </w:pPr>
+      <w:r>
+        <w:rPr>
+          <w:b/>
+          <w:color w:val="D4AF37"/>
+        </w:rPr>
+        <w:t xml:space="preserve">✓  </w:t>
+      </w:r>
+      <w:r>
+        <w:t>Продюсерское сопровождение (для выхода на крупные городские и частные заказы)</w:t>
+      </w:r>
+    </w:p>
+    <w:p>
+      <w:pPr>
+        <w:spacing w:before="280" w:after="280"/>
+        <w:pBdr>
+          <w:bottom w:val="single" w:sz="4" w:space="1" w:color="E2E8F0"/>
+        </w:pBdr>
+      </w:pPr>
+    </w:p>
+    <w:p>
+      <w:pPr>
+        <w:keepNext/>
+        <w:spacing w:before="240" w:after="80"/>
       </w:pPr>
       <w:r>
         <w:rPr>
           <w:rFonts w:ascii="Arial" w:hAnsi="Arial"/>
           <w:b/>
           <w:color w:val="0F172A"/>
-          <w:sz w:val="28"/>
+          <w:sz w:val="26"/>
         </w:rPr>
-        <w:t>1. КАКУЮ ПРОБЛЕМУ РЕШАЕТ ПРОЕКТ?</w:t>
-      </w:r>
-    </w:p>
-    <w:p>
-      <w:pPr>
-        <w:spacing w:after="240"/>
-      </w:pPr>
-      <w:r>
-        <w:t>Современный житель мегаполиса находится в состоянии хронического информационного перегруза и стресса. Приходя в культурные пространства (музеи, театры, галереи), человек приносит этот ментальный шум с собой. Его восприятие заблокировано, он не готов к глубокому эмоциональному контакту с искусством. Большинство существующих арт-объектов предлагают статичный или усредненный опыт для всей массы посетителей, не адаптируясь под психоэмоциональное состояние конкретного зрителя.</w:t>
-      </w:r>
-    </w:p>
-    <w:p>
-      <w:pPr>
-        <w:keepNext/>
-        <w:spacing w:before="280" w:after="120"/>
-      </w:pPr>
-      <w:r>
-        <w:rPr>
-          <w:rFonts w:ascii="Arial" w:hAnsi="Arial"/>
-          <w:b/>
-          <w:color w:val="0F172A"/>
-          <w:sz w:val="28"/>
-        </w:rPr>
-        <w:t>2. СУТЬ РЕШЕНИЯ И КОНЦЕПЦИЯ</w:t>
-      </w:r>
-    </w:p>
-    <w:p>
-      <w:pPr>
-        <w:spacing w:after="240"/>
-      </w:pPr>
-      <w:r>
-        <w:t>«Нейротуннель» спроектирован в новой концепции Эмотех (Emotech / Emotional Tech), направленной на создание эмоционально отзывчивых терапевтических сред. Проект представляет собой физический шлюз-фильтр в виде цилиндрического коридора или прямоугольной призмы с бесшовными LED-экранами на стыках. Проходя сквозь него, посетитель бесконтактно сканируется встроенными сенсорами. Система определяет уровень стресса, усталости или хаоса и перестраивает под него световое поле, направленный звук (бинауральные ритмы) и генеративную графику.</w:t>
-        <w:br/>
-        <w:br/>
-        <w:t>Человек проходит через иммерсивный сценарий жизненного цикла (от «рождения», через накопление опыта к «символической смерти» — очищению белым светом, и психоэмоциональному катарсису/возрождению в зале адаптации).</w:t>
-      </w:r>
-    </w:p>
-    <w:p>
-      <w:pPr>
-        <w:keepNext/>
-        <w:spacing w:before="280" w:after="120"/>
-      </w:pPr>
-      <w:r>
-        <w:rPr>
-          <w:rFonts w:ascii="Arial" w:hAnsi="Arial"/>
-          <w:b/>
-          <w:color w:val="0F172A"/>
-          <w:sz w:val="28"/>
-        </w:rPr>
-        <w:t>3. УНИКАЛЬНОСТЬ И ТЕХНОЛОГИЧЕСКАЯ НОВИЗНА (УТП)</w:t>
-      </w:r>
-    </w:p>
-    <w:p>
-      <w:pPr>
-        <w:spacing w:after="120"/>
-        <w:ind w:left="288"/>
-      </w:pPr>
-      <w:r>
-        <w:rPr>
-          <w:b/>
-          <w:color w:val="0F172A"/>
-        </w:rPr>
-        <w:t xml:space="preserve">3.1. Абсолютная бесконтактность: </w:t>
-      </w:r>
-      <w:r>
-        <w:t>Никаких датчиков на теле. Пульс и частота дыхания считываются ИК- и RGB-камерами по микро-колебаниям цвета кожи лица (rPPG), мимический тонус — алгоритмами Face Mesh, траектория движения — датчиками LiDAR.</w:t>
-      </w:r>
-    </w:p>
-    <w:p>
-      <w:pPr>
-        <w:spacing w:after="120"/>
-        <w:ind w:left="288"/>
-      </w:pPr>
-      <w:r>
-        <w:rPr>
-          <w:b/>
-          <w:color w:val="0F172A"/>
-        </w:rPr>
-        <w:t xml:space="preserve">3.2. Акустический барьер: </w:t>
-      </w:r>
-      <w:r>
-        <w:t>Направленные звуковые прожекторы Audio Spotlight (угол направленности 3-5°) полностью изолируют человека от внешнего шума улицы или холла, создавая индивидуальную звуковую зону для каждого посетителя.</w:t>
-      </w:r>
-    </w:p>
-    <w:p>
-      <w:pPr>
-        <w:spacing w:after="120"/>
-        <w:ind w:left="288"/>
-      </w:pPr>
-      <w:r>
-        <w:rPr>
-          <w:b/>
-          <w:color w:val="0F172A"/>
-        </w:rPr>
-        <w:t xml:space="preserve">3.3. Социальная синестезия (Индивидуальные ауры в толпе): </w:t>
-      </w:r>
-      <w:r>
-        <w:t>При групповом проходе туннель не создает какофонии. Он проецирует индивидуальные световые кольца («ауры») вокруг каждого пешехода. При сближении людей цвета их аур плавно смешиваются (lerp-эффект), создавая гармонизирующий визуальный диалог.</w:t>
-      </w:r>
-    </w:p>
-    <w:p>
-      <w:pPr>
-        <w:spacing w:after="120"/>
-        <w:ind w:left="288"/>
-      </w:pPr>
-      <w:r>
-        <w:rPr>
-          <w:b/>
-          <w:color w:val="0F172A"/>
-        </w:rPr>
-        <w:t xml:space="preserve">3.4. Абсолютная конфиденциальность (Privacy by Design): </w:t>
-      </w:r>
-      <w:r>
-        <w:t>Все биометрические показатели обрабатываются исключительно в оперативной памяти «на лету» без сохранения на диски или отправки в облачные сервисы, полностью отвечая требованиям о защите персональных данных.</w:t>
-      </w:r>
-    </w:p>
-    <w:p>
-      <w:pPr>
-        <w:spacing w:after="120"/>
-        <w:ind w:left="288"/>
-      </w:pPr>
-      <w:r>
-        <w:rPr>
-          <w:b/>
-          <w:color w:val="0F172A"/>
-        </w:rPr>
-        <w:t xml:space="preserve">3.5. Визионерское масштабирование: </w:t>
-      </w:r>
-      <w:r>
-        <w:t>Концепция масштабируется от локального шлюза в музее (ГЭС-2) до свето-акустических коридоров на мостах Москвы (включая переход от Храма Христа Спасителя к Красному Октябрю) и синхронизации с медиа-фасадами Москва-Сити и линиями метро в виде единой городской «Нейросети Мегаполиса».</w:t>
-      </w:r>
-    </w:p>
-    <w:p>
-      <w:pPr>
-        <w:keepNext/>
-        <w:spacing w:before="280" w:after="120"/>
-      </w:pPr>
-      <w:r>
-        <w:rPr>
-          <w:rFonts w:ascii="Arial" w:hAnsi="Arial"/>
-          <w:b/>
-          <w:color w:val="0F172A"/>
-          <w:sz w:val="28"/>
-        </w:rPr>
-        <w:t>4. ТЕХНИЧЕСКИЕ ХАРАКТЕРИСТИКИ И ОБОРУДОВАНИЕ</w:t>
+        <w:t>ДОПОЛНИТЕЛЬНО: ТЕХНИЧЕСКИЕ ХАРАКТЕРИСТИКИ</w:t>
       </w:r>
     </w:p>
     <w:tbl>
@@ -406,16 +494,16 @@
     <w:p>
       <w:pPr>
         <w:keepNext/>
-        <w:spacing w:before="280" w:after="120"/>
+        <w:spacing w:before="240" w:after="80"/>
       </w:pPr>
       <w:r>
         <w:rPr>
           <w:rFonts w:ascii="Arial" w:hAnsi="Arial"/>
           <w:b/>
           <w:color w:val="0F172A"/>
-          <w:sz w:val="28"/>
+          <w:sz w:val="26"/>
         </w:rPr>
-        <w:t>5. КОМАНДА ПРОЕКТА</w:t>
+        <w:t>КОМАНДА ПРОЕКТА</w:t>
       </w:r>
     </w:p>
     <w:p>
@@ -461,16 +549,16 @@
     <w:p>
       <w:pPr>
         <w:keepNext/>
-        <w:spacing w:before="280" w:after="120"/>
+        <w:spacing w:before="240" w:after="80"/>
       </w:pPr>
       <w:r>
         <w:rPr>
           <w:rFonts w:ascii="Arial" w:hAnsi="Arial"/>
           <w:b/>
           <w:color w:val="0F172A"/>
-          <w:sz w:val="28"/>
+          <w:sz w:val="26"/>
         </w:rPr>
-        <w:t>6. МАТЕРИАЛЫ И ССЫЛКИ ДЛЯ ПРИКРЕПЛЕНИЯ К ЗАЯВКЕ</w:t>
+        <w:t>МАТЕРИАЛЫ И ССЫЛКИ ДЛЯ ПРИКРЕПЛЕНИЯ К ЗАЯВКЕ</w:t>
       </w:r>
     </w:p>
     <w:p>
@@ -618,7 +706,7 @@
           <w:color w:val="94A3B8"/>
           <w:sz w:val="17"/>
         </w:rPr>
-        <w:t>Документ подготовлен автоматически для отправки партнёрам и соавторам проекта.</w:t>
+        <w:t>Документ подготовлен для Алёны Левицкой и Валерия Латыпова. Скопируйте нужные разделы напрямую в веб-форму.</w:t>
       </w:r>
     </w:p>
     <w:sectPr>

</xml_diff>